<commit_message>
Update DBMS Report cover page: Woxsen logo, School of Technology, student name in black
</commit_message>
<xml_diff>
--- a/docx/DBMS REPORT.docx
+++ b/docx/DBMS REPORT.docx
@@ -19,7 +19,7 @@
               <a:graphicData uri="http://schemas.openxmlformats.org/drawingml/2006/picture">
                 <pic:pic>
                   <pic:nvPicPr>
-                    <pic:cNvPr id="0" name="woxsen_logo.png"/>
+                    <pic:cNvPr id="0" name="image.png"/>
                     <pic:cNvPicPr/>
                   </pic:nvPicPr>
                   <pic:blipFill>
@@ -131,7 +131,7 @@
             <w:r>
               <w:rPr>
                 <w:b/>
-                <w:color w:val="0284C7"/>
+                <w:color w:val="000000"/>
                 <w:sz w:val="24"/>
               </w:rPr>
               <w:t>Sakhunala Sahaja</w:t>
@@ -171,7 +171,7 @@
               <w:rPr>
                 <w:sz w:val="22"/>
               </w:rPr>
-              <w:t>Academic Year: 2025 – 2026</w:t>
+              <w:t>Academic Year: 2025 - 2026</w:t>
             </w:r>
           </w:p>
         </w:tc>

</xml_diff>

<commit_message>
Add normalized 3NF table example (ORDER_ITEM) to Section 7.2 in report docx
</commit_message>
<xml_diff>
--- a/docx/DBMS REPORT.docx
+++ b/docx/DBMS REPORT.docx
@@ -1896,33 +1896,37 @@
     <w:p>
       <w:r>
         <w:t>• First Normal Form (1NF): All attributes are strictly atomic (single-valued). Multi-valued food tags are converted into structured enumerations or child entities. Every relation has a defined primary key.</w:t>
-      </w:r>
-      <w:r>
-        <w:br w:type="textWrapping"/>
-      </w:r>
-      <w:r>
-        <w:br w:type="textWrapping"/>
-      </w:r>
-      <w:r>
+        <w:br/>
+        <w:br/>
         <w:t>• Second Normal Form (2NF): The schema satisfies 1NF and contains no partial functional dependencies. In composite and junction entities (e.g. ORDER_ITEM), non-key attributes (quantity, unit_price, special_request) depend fully on the entire candidate key (order_item_id) rather than a subset.</w:t>
-      </w:r>
-      <w:r>
-        <w:br w:type="textWrapping"/>
-      </w:r>
-      <w:r>
-        <w:br w:type="textWrapping"/>
-      </w:r>
-      <w:r>
+        <w:br/>
+        <w:br/>
         <w:t>• Third Normal Form (3NF): The schema satisfies 2NF and contains no transitive dependencies (X -&gt; Y and Y -&gt; Z where Z is non-prime). Calculated metrics (e.g. line_total = quantity * unit_price, grand_total = subtotal - discount + tax) are either computed dynamically in SQL views or decoupled into immutable audit transaction ledgers.</w:t>
-      </w:r>
-      <w:r>
-        <w:br w:type="textWrapping"/>
-      </w:r>
-      <w:r>
-        <w:br w:type="textWrapping"/>
-      </w:r>
-      <w:r>
+        <w:br/>
+        <w:br/>
         <w:t>• Boyce-Codd Normal Form (BCNF): For every functional dependency X -&gt; Y, X is a superkey across all relations.</w:t>
+        <w:br/>
+        <w:t>Example of a Normalized 3NF Relation: ORDER_ITEM</w:t>
+        <w:br/>
+        <w:t>• Schema: ORDER_ITEM (id [PK], order_id [FK-&gt;CUSTOMER_ORDER.id], item_id [FK-&gt;MENU_ITEM.id], quantity, unit_price, special_requests, created_at, updated_at)</w:t>
+        <w:br/>
+        <w:t>• Candidate Key: {id}</w:t>
+        <w:br/>
+        <w:t>• Functional Dependencies:</w:t>
+        <w:br/>
+        <w:t xml:space="preserve">  - FD1: id -&gt; {order_id, item_id, quantity, unit_price, special_requests, created_at, updated_at}</w:t>
+        <w:br/>
+        <w:t>• 1NF Compliance: All attributes contain strictly atomic, single-valued entries without nested multi-value collections.</w:t>
+        <w:br/>
+        <w:t>• 2NF Compliance: The relation utilizes a single surrogate Primary Key (id). Because there is no composite candidate key, no partial functional dependencies exist.</w:t>
+        <w:br/>
+        <w:t>• 3NF Compliance (No Transitive Dependencies):</w:t>
+        <w:br/>
+        <w:t xml:space="preserve">  - In an unnormalized design, storing {item_name, category_name, catalog_price} in ORDER_ITEM introduces the transitive dependency: id -&gt; item_id -&gt; {item_name, category_name}.</w:t>
+        <w:br/>
+        <w:t xml:space="preserve">  - Under 3NF, descriptive item attributes are normalized into the MENU_ITEM relation. ORDER_ITEM only retains the foreign key (item_id) and the immutable point-of-sale transaction price (unit_price).</w:t>
+        <w:br/>
+        <w:t xml:space="preserve">  - Calculated values (line_total = quantity * unit_price) are omitted from physical storage and calculated dynamically in SQL views.</w:t>
       </w:r>
     </w:p>
     <w:p>

</xml_diff>

<commit_message>
Insert DDL table creation execution screenshot under Section 9.1
</commit_message>
<xml_diff>
--- a/docx/DBMS REPORT.docx
+++ b/docx/DBMS REPORT.docx
@@ -7261,6 +7261,40 @@
       <w:pPr>
         <w:spacing w:after="80"/>
       </w:pPr>
+      <w:r>
+        <w:drawing>
+          <wp:inline xmlns:a="http://schemas.openxmlformats.org/drawingml/2006/main" xmlns:pic="http://schemas.openxmlformats.org/drawingml/2006/picture">
+            <wp:extent cx="5943600" cy="997117"/>
+            <wp:docPr id="12" name="Picture 12"/>
+            <wp:cNvGraphicFramePr>
+              <a:graphicFrameLocks noChangeAspect="1"/>
+            </wp:cNvGraphicFramePr>
+            <a:graphic>
+              <a:graphicData uri="http://schemas.openxmlformats.org/drawingml/2006/picture">
+                <pic:pic>
+                  <pic:nvPicPr>
+                    <pic:cNvPr id="0" name="media_1791341828585.png"/>
+                    <pic:cNvPicPr/>
+                  </pic:nvPicPr>
+                  <pic:blipFill>
+                    <a:blip r:embed="rId15"/>
+                    <a:stretch>
+                      <a:fillRect/>
+                    </a:stretch>
+                  </pic:blipFill>
+                  <pic:spPr>
+                    <a:xfrm>
+                      <a:off x="0" y="0"/>
+                      <a:ext cx="5943600" cy="997117"/>
+                    </a:xfrm>
+                    <a:prstGeom prst="rect"/>
+                  </pic:spPr>
+                </pic:pic>
+              </a:graphicData>
+            </a:graphic>
+          </wp:inline>
+        </w:drawing>
+      </w:r>
     </w:p>
     <w:p>
       <w:pPr>

</xml_diff>

<commit_message>
Fix PDF image rendering: encode screenshot as standard DCTDecode RGB without transparency mask
</commit_message>
<xml_diff>
--- a/docx/DBMS REPORT.docx
+++ b/docx/DBMS REPORT.docx
@@ -7261,6 +7261,7 @@
       <w:pPr>
         <w:spacing w:after="80"/>
       </w:pPr>
+      <w:r/>
       <w:r>
         <w:drawing>
           <wp:inline xmlns:a="http://schemas.openxmlformats.org/drawingml/2006/main" xmlns:pic="http://schemas.openxmlformats.org/drawingml/2006/picture">
@@ -7273,11 +7274,11 @@
               <a:graphicData uri="http://schemas.openxmlformats.org/drawingml/2006/picture">
                 <pic:pic>
                   <pic:nvPicPr>
-                    <pic:cNvPr id="0" name="media_1791341828585.png"/>
+                    <pic:cNvPr id="0" name="ddl_execution_output.jpg"/>
                     <pic:cNvPicPr/>
                   </pic:nvPicPr>
                   <pic:blipFill>
-                    <a:blip r:embed="rId15"/>
+                    <a:blip r:embed="rId16"/>
                     <a:stretch>
                       <a:fillRect/>
                     </a:stretch>

</xml_diff>

<commit_message>
Insert DML execution sample output screenshots under Section 9.2
</commit_message>
<xml_diff>
--- a/docx/DBMS REPORT.docx
+++ b/docx/DBMS REPORT.docx
@@ -10168,6 +10168,111 @@
       <w:pPr>
         <w:spacing w:after="120"/>
       </w:pPr>
+      <w:r/>
+      <w:r>
+        <w:drawing>
+          <wp:inline xmlns:a="http://schemas.openxmlformats.org/drawingml/2006/main" xmlns:pic="http://schemas.openxmlformats.org/drawingml/2006/picture">
+            <wp:extent cx="5943600" cy="975122"/>
+            <wp:docPr id="13" name="Picture 13"/>
+            <wp:cNvGraphicFramePr>
+              <a:graphicFrameLocks noChangeAspect="1"/>
+            </wp:cNvGraphicFramePr>
+            <a:graphic>
+              <a:graphicData uri="http://schemas.openxmlformats.org/drawingml/2006/picture">
+                <pic:pic>
+                  <pic:nvPicPr>
+                    <pic:cNvPr id="0" name="dml_output_1.jpg"/>
+                    <pic:cNvPicPr/>
+                  </pic:nvPicPr>
+                  <pic:blipFill>
+                    <a:blip r:embed="rId17"/>
+                    <a:stretch>
+                      <a:fillRect/>
+                    </a:stretch>
+                  </pic:blipFill>
+                  <pic:spPr>
+                    <a:xfrm>
+                      <a:off x="0" y="0"/>
+                      <a:ext cx="5943600" cy="975122"/>
+                    </a:xfrm>
+                    <a:prstGeom prst="rect"/>
+                  </pic:spPr>
+                </pic:pic>
+              </a:graphicData>
+            </a:graphic>
+          </wp:inline>
+        </w:drawing>
+        <w:br/>
+      </w:r>
+      <w:r>
+        <w:drawing>
+          <wp:inline xmlns:a="http://schemas.openxmlformats.org/drawingml/2006/main" xmlns:pic="http://schemas.openxmlformats.org/drawingml/2006/picture">
+            <wp:extent cx="5943600" cy="2115403"/>
+            <wp:docPr id="14" name="Picture 14"/>
+            <wp:cNvGraphicFramePr>
+              <a:graphicFrameLocks noChangeAspect="1"/>
+            </wp:cNvGraphicFramePr>
+            <a:graphic>
+              <a:graphicData uri="http://schemas.openxmlformats.org/drawingml/2006/picture">
+                <pic:pic>
+                  <pic:nvPicPr>
+                    <pic:cNvPr id="0" name="dml_output_2.jpg"/>
+                    <pic:cNvPicPr/>
+                  </pic:nvPicPr>
+                  <pic:blipFill>
+                    <a:blip r:embed="rId18"/>
+                    <a:stretch>
+                      <a:fillRect/>
+                    </a:stretch>
+                  </pic:blipFill>
+                  <pic:spPr>
+                    <a:xfrm>
+                      <a:off x="0" y="0"/>
+                      <a:ext cx="5943600" cy="2115403"/>
+                    </a:xfrm>
+                    <a:prstGeom prst="rect"/>
+                  </pic:spPr>
+                </pic:pic>
+              </a:graphicData>
+            </a:graphic>
+          </wp:inline>
+        </w:drawing>
+        <w:br/>
+      </w:r>
+      <w:r>
+        <w:drawing>
+          <wp:inline xmlns:a="http://schemas.openxmlformats.org/drawingml/2006/main" xmlns:pic="http://schemas.openxmlformats.org/drawingml/2006/picture">
+            <wp:extent cx="5943600" cy="661690"/>
+            <wp:docPr id="15" name="Picture 15"/>
+            <wp:cNvGraphicFramePr>
+              <a:graphicFrameLocks noChangeAspect="1"/>
+            </wp:cNvGraphicFramePr>
+            <a:graphic>
+              <a:graphicData uri="http://schemas.openxmlformats.org/drawingml/2006/picture">
+                <pic:pic>
+                  <pic:nvPicPr>
+                    <pic:cNvPr id="0" name="dml_output_3.jpg"/>
+                    <pic:cNvPicPr/>
+                  </pic:nvPicPr>
+                  <pic:blipFill>
+                    <a:blip r:embed="rId19"/>
+                    <a:stretch>
+                      <a:fillRect/>
+                    </a:stretch>
+                  </pic:blipFill>
+                  <pic:spPr>
+                    <a:xfrm>
+                      <a:off x="0" y="0"/>
+                      <a:ext cx="5943600" cy="661690"/>
+                    </a:xfrm>
+                    <a:prstGeom prst="rect"/>
+                  </pic:spPr>
+                </pic:pic>
+              </a:graphicData>
+            </a:graphic>
+          </wp:inline>
+        </w:drawing>
+      </w:r>
     </w:p>
     <w:p>
       <w:pPr>

</xml_diff>

<commit_message>
Remove active customer reservations screenshot from Section 9.2
</commit_message>
<xml_diff>
--- a/docx/DBMS REPORT.docx
+++ b/docx/DBMS REPORT.docx
@@ -10181,7 +10181,7 @@
               <a:graphicData uri="http://schemas.openxmlformats.org/drawingml/2006/picture">
                 <pic:pic>
                   <pic:nvPicPr>
-                    <pic:cNvPr id="0" name="dml_output_1.jpg"/>
+                    <pic:cNvPr id="0" name="image.jpg"/>
                     <pic:cNvPicPr/>
                   </pic:nvPicPr>
                   <pic:blipFill>
@@ -10216,7 +10216,7 @@
               <a:graphicData uri="http://schemas.openxmlformats.org/drawingml/2006/picture">
                 <pic:pic>
                   <pic:nvPicPr>
-                    <pic:cNvPr id="0" name="dml_output_2.jpg"/>
+                    <pic:cNvPr id="0" name="image.jpg"/>
                     <pic:cNvPicPr/>
                   </pic:nvPicPr>
                   <pic:blipFill>
@@ -10229,41 +10229,6 @@
                     <a:xfrm>
                       <a:off x="0" y="0"/>
                       <a:ext cx="5943600" cy="2115403"/>
-                    </a:xfrm>
-                    <a:prstGeom prst="rect"/>
-                  </pic:spPr>
-                </pic:pic>
-              </a:graphicData>
-            </a:graphic>
-          </wp:inline>
-        </w:drawing>
-        <w:br/>
-      </w:r>
-      <w:r>
-        <w:drawing>
-          <wp:inline xmlns:a="http://schemas.openxmlformats.org/drawingml/2006/main" xmlns:pic="http://schemas.openxmlformats.org/drawingml/2006/picture">
-            <wp:extent cx="5943600" cy="661690"/>
-            <wp:docPr id="15" name="Picture 15"/>
-            <wp:cNvGraphicFramePr>
-              <a:graphicFrameLocks noChangeAspect="1"/>
-            </wp:cNvGraphicFramePr>
-            <a:graphic>
-              <a:graphicData uri="http://schemas.openxmlformats.org/drawingml/2006/picture">
-                <pic:pic>
-                  <pic:nvPicPr>
-                    <pic:cNvPr id="0" name="dml_output_3.jpg"/>
-                    <pic:cNvPicPr/>
-                  </pic:nvPicPr>
-                  <pic:blipFill>
-                    <a:blip r:embed="rId19"/>
-                    <a:stretch>
-                      <a:fillRect/>
-                    </a:stretch>
-                  </pic:blipFill>
-                  <pic:spPr>
-                    <a:xfrm>
-                      <a:off x="0" y="0"/>
-                      <a:ext cx="5943600" cy="661690"/>
                     </a:xfrm>
                     <a:prstGeom prst="rect"/>
                   </pic:spPr>

</xml_diff>

<commit_message>
Replace Query 10.2 with customer order item and serving status query and output
</commit_message>
<xml_diff>
--- a/docx/DBMS REPORT.docx
+++ b/docx/DBMS REPORT.docx
@@ -9030,13 +9030,7 @@
         <w:spacing w:before="280" w:after="120"/>
       </w:pPr>
       <w:r>
-        <w:rPr>
-          <w:rFonts w:ascii="Calibri" w:hAnsi="Calibri"/>
-          <w:b/>
-          <w:color w:val="35598F"/>
-          <w:sz w:val="28"/>
-        </w:rPr>
-        <w:t>Query 10.2: Presentation-II Query: Revenue &amp; Item Performance by Category</w:t>
+        <w:t>Query 10.2: Presentation-II Query: Customer Orders, Table ID &amp; Serving Status Tracker</w:t>
       </w:r>
     </w:p>
     <w:tbl>
@@ -9085,160 +9079,38 @@
             </w:tcMar>
           </w:tcPr>
           <w:p>
-            <w:pPr>
-              <w:spacing w:before="80" w:after="80" w:line="276" w:lineRule="auto"/>
-            </w:pPr>
-            <w:r>
-              <w:rPr>
-                <w:rFonts w:ascii="Consolas" w:hAnsi="Consolas"/>
-                <w:color w:val="1E1E1E"/>
-                <w:sz w:val="18"/>
-              </w:rPr>
+            <w:r>
               <w:t xml:space="preserve">SELECT </w:t>
-            </w:r>
-            <w:r>
-              <w:rPr>
-                <w:rFonts w:ascii="Consolas" w:hAnsi="Consolas"/>
-                <w:color w:val="1E1E1E"/>
-                <w:sz w:val="18"/>
-              </w:rPr>
-              <w:br w:type="textWrapping"/>
-            </w:r>
-            <w:r>
-              <w:rPr>
-                <w:rFonts w:ascii="Consolas" w:hAnsi="Consolas"/>
-                <w:color w:val="1E1E1E"/>
-                <w:sz w:val="18"/>
-              </w:rPr>
-              <w:t xml:space="preserve">        m.category AS dish_category,</w:t>
-            </w:r>
-            <w:r>
-              <w:rPr>
-                <w:rFonts w:ascii="Consolas" w:hAnsi="Consolas"/>
-                <w:color w:val="1E1E1E"/>
-                <w:sz w:val="18"/>
-              </w:rPr>
-              <w:br w:type="textWrapping"/>
-            </w:r>
-            <w:r>
-              <w:rPr>
-                <w:rFonts w:ascii="Consolas" w:hAnsi="Consolas"/>
-                <w:color w:val="1E1E1E"/>
-                <w:sz w:val="18"/>
-              </w:rPr>
-              <w:t xml:space="preserve">        COUNT(oi.id) AS total_orders_placed,</w:t>
-            </w:r>
-            <w:r>
-              <w:rPr>
-                <w:rFonts w:ascii="Consolas" w:hAnsi="Consolas"/>
-                <w:color w:val="1E1E1E"/>
-                <w:sz w:val="18"/>
-              </w:rPr>
-              <w:br w:type="textWrapping"/>
-            </w:r>
-            <w:r>
-              <w:rPr>
-                <w:rFonts w:ascii="Consolas" w:hAnsi="Consolas"/>
-                <w:color w:val="1E1E1E"/>
-                <w:sz w:val="18"/>
-              </w:rPr>
-              <w:t xml:space="preserve">        SUM(oi.quantity) AS total_portions_sold,</w:t>
-            </w:r>
-            <w:r>
-              <w:rPr>
-                <w:rFonts w:ascii="Consolas" w:hAnsi="Consolas"/>
-                <w:color w:val="1E1E1E"/>
-                <w:sz w:val="18"/>
-              </w:rPr>
-              <w:br w:type="textWrapping"/>
-            </w:r>
-            <w:r>
-              <w:rPr>
-                <w:rFonts w:ascii="Consolas" w:hAnsi="Consolas"/>
-                <w:color w:val="1E1E1E"/>
-                <w:sz w:val="18"/>
-              </w:rPr>
-              <w:t xml:space="preserve">        PRINTF('₹%.2f', SUM(oi.quantity * oi.unit_price)) AS gross_revenue,</w:t>
-            </w:r>
-            <w:r>
-              <w:rPr>
-                <w:rFonts w:ascii="Consolas" w:hAnsi="Consolas"/>
-                <w:color w:val="1E1E1E"/>
-                <w:sz w:val="18"/>
-              </w:rPr>
-              <w:br w:type="textWrapping"/>
-            </w:r>
-            <w:r>
-              <w:rPr>
-                <w:rFonts w:ascii="Consolas" w:hAnsi="Consolas"/>
-                <w:color w:val="1E1E1E"/>
-                <w:sz w:val="18"/>
-              </w:rPr>
-              <w:t xml:space="preserve">        PRINTF('₹%.2f', AVG(oi.unit_price)) AS avg_portion_price</w:t>
-            </w:r>
-            <w:r>
-              <w:rPr>
-                <w:rFonts w:ascii="Consolas" w:hAnsi="Consolas"/>
-                <w:color w:val="1E1E1E"/>
-                <w:sz w:val="18"/>
-              </w:rPr>
-              <w:br w:type="textWrapping"/>
-            </w:r>
-            <w:r>
-              <w:rPr>
-                <w:rFonts w:ascii="Consolas" w:hAnsi="Consolas"/>
-                <w:color w:val="1E1E1E"/>
-                <w:sz w:val="18"/>
-              </w:rPr>
-              <w:t xml:space="preserve">    FROM menu_item m</w:t>
-            </w:r>
-            <w:r>
-              <w:rPr>
-                <w:rFonts w:ascii="Consolas" w:hAnsi="Consolas"/>
-                <w:color w:val="1E1E1E"/>
-                <w:sz w:val="18"/>
-              </w:rPr>
-              <w:br w:type="textWrapping"/>
-            </w:r>
-            <w:r>
-              <w:rPr>
-                <w:rFonts w:ascii="Consolas" w:hAnsi="Consolas"/>
-                <w:color w:val="1E1E1E"/>
-                <w:sz w:val="18"/>
-              </w:rPr>
-              <w:t xml:space="preserve">    INNER JOIN order_item oi ON m.id = oi.item_id</w:t>
-            </w:r>
-            <w:r>
-              <w:rPr>
-                <w:rFonts w:ascii="Consolas" w:hAnsi="Consolas"/>
-                <w:color w:val="1E1E1E"/>
-                <w:sz w:val="18"/>
-              </w:rPr>
-              <w:br w:type="textWrapping"/>
-            </w:r>
-            <w:r>
-              <w:rPr>
-                <w:rFonts w:ascii="Consolas" w:hAnsi="Consolas"/>
-                <w:color w:val="1E1E1E"/>
-                <w:sz w:val="18"/>
-              </w:rPr>
-              <w:t xml:space="preserve">    GROUP BY m.category</w:t>
-            </w:r>
-            <w:r>
-              <w:rPr>
-                <w:rFonts w:ascii="Consolas" w:hAnsi="Consolas"/>
-                <w:color w:val="1E1E1E"/>
-                <w:sz w:val="18"/>
-              </w:rPr>
-              <w:br w:type="textWrapping"/>
-            </w:r>
-            <w:r>
-              <w:rPr>
-                <w:rFonts w:ascii="Consolas" w:hAnsi="Consolas"/>
-                <w:color w:val="1E1E1E"/>
-                <w:sz w:val="18"/>
-              </w:rPr>
-              <w:t xml:space="preserve">    ORDER BY SUM(oi.quantity * oi.unit_price) DESC;</w:t>
+              <w:br/>
+              <w:t xml:space="preserve">    c.first_name || ' ' || c.last_name AS customer_name,</w:t>
+              <w:br/>
+              <w:t xml:space="preserve">    t.table_number AS table_id,</w:t>
+              <w:br/>
+              <w:t xml:space="preserve">    m.name AS item_ordered,</w:t>
+              <w:br/>
+              <w:t xml:space="preserve">    oi.quantity,</w:t>
+              <w:br/>
+              <w:t xml:space="preserve">    CASE </w:t>
+              <w:br/>
+              <w:t xml:space="preserve">        WHEN o.status = 'SERVED' THEN 'Served'</w:t>
+              <w:br/>
+              <w:t xml:space="preserve">        ELSE 'Not Served'</w:t>
+              <w:br/>
+              <w:t xml:space="preserve">    END AS serving_status</w:t>
+              <w:br/>
+              <w:t>FROM customer c</w:t>
+              <w:br/>
+              <w:t>INNER JOIN dining_session s ON c.id = s.customer_id</w:t>
+              <w:br/>
+              <w:t>INNER JOIN table_entity t ON s.table_id = t.id</w:t>
+              <w:br/>
+              <w:t>INNER JOIN customer_order o ON s.id = o.session_id</w:t>
+              <w:br/>
+              <w:t>INNER JOIN order_item oi ON o.id = oi.order_id</w:t>
+              <w:br/>
+              <w:t>INNER JOIN menu_item m ON oi.item_id = m.id</w:t>
+              <w:br/>
+              <w:t>ORDER BY t.table_number ASC, customer_name ASC;</w:t>
             </w:r>
           </w:p>
         </w:tc>
@@ -9309,18 +9181,8 @@
             </w:tcMar>
           </w:tcPr>
           <w:p>
-            <w:pPr>
-              <w:spacing w:before="40" w:after="40"/>
-              <w:jc w:val="left"/>
-            </w:pPr>
-            <w:r>
-              <w:rPr>
-                <w:rFonts w:ascii="Calibri" w:hAnsi="Calibri"/>
-                <w:b/>
-                <w:color w:val="FFFFFF"/>
-                <w:sz w:val="19"/>
-              </w:rPr>
-              <w:t>dish_category</w:t>
+            <w:r>
+              <w:t>customer_name</w:t>
             </w:r>
           </w:p>
         </w:tc>
@@ -9336,18 +9198,8 @@
             </w:tcMar>
           </w:tcPr>
           <w:p>
-            <w:pPr>
-              <w:spacing w:before="40" w:after="40"/>
-              <w:jc w:val="left"/>
-            </w:pPr>
-            <w:r>
-              <w:rPr>
-                <w:rFonts w:ascii="Calibri" w:hAnsi="Calibri"/>
-                <w:b/>
-                <w:color w:val="FFFFFF"/>
-                <w:sz w:val="19"/>
-              </w:rPr>
-              <w:t>total_orders_placed</w:t>
+            <w:r>
+              <w:t>table_id</w:t>
             </w:r>
           </w:p>
         </w:tc>
@@ -9363,18 +9215,8 @@
             </w:tcMar>
           </w:tcPr>
           <w:p>
-            <w:pPr>
-              <w:spacing w:before="40" w:after="40"/>
-              <w:jc w:val="left"/>
-            </w:pPr>
-            <w:r>
-              <w:rPr>
-                <w:rFonts w:ascii="Calibri" w:hAnsi="Calibri"/>
-                <w:b/>
-                <w:color w:val="FFFFFF"/>
-                <w:sz w:val="19"/>
-              </w:rPr>
-              <w:t>total_portions_sold</w:t>
+            <w:r>
+              <w:t>item_ordered</w:t>
             </w:r>
           </w:p>
         </w:tc>
@@ -9390,18 +9232,8 @@
             </w:tcMar>
           </w:tcPr>
           <w:p>
-            <w:pPr>
-              <w:spacing w:before="40" w:after="40"/>
-              <w:jc w:val="left"/>
-            </w:pPr>
-            <w:r>
-              <w:rPr>
-                <w:rFonts w:ascii="Calibri" w:hAnsi="Calibri"/>
-                <w:b/>
-                <w:color w:val="FFFFFF"/>
-                <w:sz w:val="19"/>
-              </w:rPr>
-              <w:t>gross_revenue</w:t>
+            <w:r>
+              <w:t>quantity</w:t>
             </w:r>
           </w:p>
         </w:tc>
@@ -9417,18 +9249,8 @@
             </w:tcMar>
           </w:tcPr>
           <w:p>
-            <w:pPr>
-              <w:spacing w:before="40" w:after="40"/>
-              <w:jc w:val="left"/>
-            </w:pPr>
-            <w:r>
-              <w:rPr>
-                <w:rFonts w:ascii="Calibri" w:hAnsi="Calibri"/>
-                <w:b/>
-                <w:color w:val="FFFFFF"/>
-                <w:sz w:val="19"/>
-              </w:rPr>
-              <w:t>avg_portion_price</w:t>
+            <w:r>
+              <w:t>serving_status</w:t>
             </w:r>
           </w:p>
         </w:tc>
@@ -9465,16 +9287,8 @@
             </w:tcMar>
           </w:tcPr>
           <w:p>
-            <w:pPr>
-              <w:spacing w:before="40" w:after="40"/>
-            </w:pPr>
-            <w:r>
-              <w:rPr>
-                <w:rFonts w:ascii="Calibri" w:hAnsi="Calibri"/>
-                <w:color w:val="282828"/>
-                <w:sz w:val="18"/>
-              </w:rPr>
-              <w:t>Main Course</w:t>
+            <w:r>
+              <w:t>Sakhunala Sahaja</w:t>
             </w:r>
           </w:p>
         </w:tc>
@@ -9490,16 +9304,8 @@
             </w:tcMar>
           </w:tcPr>
           <w:p>
-            <w:pPr>
-              <w:spacing w:before="40" w:after="40"/>
-            </w:pPr>
-            <w:r>
-              <w:rPr>
-                <w:rFonts w:ascii="Calibri" w:hAnsi="Calibri"/>
-                <w:color w:val="282828"/>
-                <w:sz w:val="18"/>
-              </w:rPr>
-              <w:t>28</w:t>
+            <w:r>
+              <w:t>R03</w:t>
             </w:r>
           </w:p>
         </w:tc>
@@ -9515,16 +9321,8 @@
             </w:tcMar>
           </w:tcPr>
           <w:p>
-            <w:pPr>
-              <w:spacing w:before="40" w:after="40"/>
-            </w:pPr>
-            <w:r>
-              <w:rPr>
-                <w:rFonts w:ascii="Calibri" w:hAnsi="Calibri"/>
-                <w:color w:val="282828"/>
-                <w:sz w:val="18"/>
-              </w:rPr>
-              <w:t>42</w:t>
+            <w:r>
+              <w:t>Chicken Alfredo Fettuccine</w:t>
             </w:r>
           </w:p>
         </w:tc>
@@ -9540,16 +9338,8 @@
             </w:tcMar>
           </w:tcPr>
           <w:p>
-            <w:pPr>
-              <w:spacing w:before="40" w:after="40"/>
-            </w:pPr>
-            <w:r>
-              <w:rPr>
-                <w:rFonts w:ascii="Calibri" w:hAnsi="Calibri"/>
-                <w:color w:val="282828"/>
-                <w:sz w:val="18"/>
-              </w:rPr>
-              <w:t>₹18,900.00</w:t>
+            <w:r>
+              <w:t>1</w:t>
             </w:r>
           </w:p>
         </w:tc>
@@ -9565,16 +9355,8 @@
             </w:tcMar>
           </w:tcPr>
           <w:p>
-            <w:pPr>
-              <w:spacing w:before="40" w:after="40"/>
-            </w:pPr>
-            <w:r>
-              <w:rPr>
-                <w:rFonts w:ascii="Calibri" w:hAnsi="Calibri"/>
-                <w:color w:val="282828"/>
-                <w:sz w:val="18"/>
-              </w:rPr>
-              <w:t>₹450.00</w:t>
+            <w:r>
+              <w:t>Served</w:t>
             </w:r>
           </w:p>
         </w:tc>
@@ -9611,16 +9393,8 @@
             </w:tcMar>
           </w:tcPr>
           <w:p>
-            <w:pPr>
-              <w:spacing w:before="40" w:after="40"/>
-            </w:pPr>
-            <w:r>
-              <w:rPr>
-                <w:rFonts w:ascii="Calibri" w:hAnsi="Calibri"/>
-                <w:color w:val="282828"/>
-                <w:sz w:val="18"/>
-              </w:rPr>
-              <w:t>Indian Specialties</w:t>
+            <w:r>
+              <w:t>Sakhunala Sahaja</w:t>
             </w:r>
           </w:p>
         </w:tc>
@@ -9636,16 +9410,8 @@
             </w:tcMar>
           </w:tcPr>
           <w:p>
-            <w:pPr>
-              <w:spacing w:before="40" w:after="40"/>
-            </w:pPr>
-            <w:r>
-              <w:rPr>
-                <w:rFonts w:ascii="Calibri" w:hAnsi="Calibri"/>
-                <w:color w:val="282828"/>
-                <w:sz w:val="18"/>
-              </w:rPr>
-              <w:t>34</w:t>
+            <w:r>
+              <w:t>R03</w:t>
             </w:r>
           </w:p>
         </w:tc>
@@ -9661,16 +9427,8 @@
             </w:tcMar>
           </w:tcPr>
           <w:p>
-            <w:pPr>
-              <w:spacing w:before="40" w:after="40"/>
-            </w:pPr>
-            <w:r>
-              <w:rPr>
-                <w:rFonts w:ascii="Calibri" w:hAnsi="Calibri"/>
-                <w:color w:val="282828"/>
-                <w:sz w:val="18"/>
-              </w:rPr>
-              <w:t>58</w:t>
+            <w:r>
+              <w:t>Signature Wild Berry Spritzer</w:t>
             </w:r>
           </w:p>
         </w:tc>
@@ -9686,16 +9444,8 @@
             </w:tcMar>
           </w:tcPr>
           <w:p>
-            <w:pPr>
-              <w:spacing w:before="40" w:after="40"/>
-            </w:pPr>
-            <w:r>
-              <w:rPr>
-                <w:rFonts w:ascii="Calibri" w:hAnsi="Calibri"/>
-                <w:color w:val="282828"/>
-                <w:sz w:val="18"/>
-              </w:rPr>
-              <w:t>₹16,240.00</w:t>
+            <w:r>
+              <w:t>2</w:t>
             </w:r>
           </w:p>
         </w:tc>
@@ -9711,16 +9461,8 @@
             </w:tcMar>
           </w:tcPr>
           <w:p>
-            <w:pPr>
-              <w:spacing w:before="40" w:after="40"/>
-            </w:pPr>
-            <w:r>
-              <w:rPr>
-                <w:rFonts w:ascii="Calibri" w:hAnsi="Calibri"/>
-                <w:color w:val="282828"/>
-                <w:sz w:val="18"/>
-              </w:rPr>
-              <w:t>₹280.00</w:t>
+            <w:r>
+              <w:t>Served</w:t>
             </w:r>
           </w:p>
         </w:tc>
@@ -9757,16 +9499,8 @@
             </w:tcMar>
           </w:tcPr>
           <w:p>
-            <w:pPr>
-              <w:spacing w:before="40" w:after="40"/>
-            </w:pPr>
-            <w:r>
-              <w:rPr>
-                <w:rFonts w:ascii="Calibri" w:hAnsi="Calibri"/>
-                <w:color w:val="282828"/>
-                <w:sz w:val="18"/>
-              </w:rPr>
-              <w:t>Appetizers</w:t>
+            <w:r>
+              <w:t>Rajesh &amp; Priya Sharma</w:t>
             </w:r>
           </w:p>
         </w:tc>
@@ -9782,16 +9516,8 @@
             </w:tcMar>
           </w:tcPr>
           <w:p>
-            <w:pPr>
-              <w:spacing w:before="40" w:after="40"/>
-            </w:pPr>
-            <w:r>
-              <w:rPr>
-                <w:rFonts w:ascii="Calibri" w:hAnsi="Calibri"/>
-                <w:color w:val="282828"/>
-                <w:sz w:val="18"/>
-              </w:rPr>
-              <w:t>45</w:t>
+            <w:r>
+              <w:t>T03</w:t>
             </w:r>
           </w:p>
         </w:tc>
@@ -9807,16 +9533,8 @@
             </w:tcMar>
           </w:tcPr>
           <w:p>
-            <w:pPr>
-              <w:spacing w:before="40" w:after="40"/>
-            </w:pPr>
-            <w:r>
-              <w:rPr>
-                <w:rFonts w:ascii="Calibri" w:hAnsi="Calibri"/>
-                <w:color w:val="282828"/>
-                <w:sz w:val="18"/>
-              </w:rPr>
-              <w:t>62</w:t>
+            <w:r>
+              <w:t>Dum Murgh Awadhi Biryani</w:t>
             </w:r>
           </w:p>
         </w:tc>
@@ -9832,16 +9550,8 @@
             </w:tcMar>
           </w:tcPr>
           <w:p>
-            <w:pPr>
-              <w:spacing w:before="40" w:after="40"/>
-            </w:pPr>
-            <w:r>
-              <w:rPr>
-                <w:rFonts w:ascii="Calibri" w:hAnsi="Calibri"/>
-                <w:color w:val="282828"/>
-                <w:sz w:val="18"/>
-              </w:rPr>
-              <w:t>₹14,880.00</w:t>
+            <w:r>
+              <w:t>2</w:t>
             </w:r>
           </w:p>
         </w:tc>
@@ -9857,16 +9567,8 @@
             </w:tcMar>
           </w:tcPr>
           <w:p>
-            <w:pPr>
-              <w:spacing w:before="40" w:after="40"/>
-            </w:pPr>
-            <w:r>
-              <w:rPr>
-                <w:rFonts w:ascii="Calibri" w:hAnsi="Calibri"/>
-                <w:color w:val="282828"/>
-                <w:sz w:val="18"/>
-              </w:rPr>
-              <w:t>₹240.00</w:t>
+            <w:r>
+              <w:t>Served</w:t>
             </w:r>
           </w:p>
         </w:tc>
@@ -9903,16 +9605,8 @@
             </w:tcMar>
           </w:tcPr>
           <w:p>
-            <w:pPr>
-              <w:spacing w:before="40" w:after="40"/>
-            </w:pPr>
-            <w:r>
-              <w:rPr>
-                <w:rFonts w:ascii="Calibri" w:hAnsi="Calibri"/>
-                <w:color w:val="282828"/>
-                <w:sz w:val="18"/>
-              </w:rPr>
-              <w:t>Beverages &amp; Mocktails</w:t>
+            <w:r>
+              <w:t>Rajesh &amp; Priya Sharma</w:t>
             </w:r>
           </w:p>
         </w:tc>
@@ -9928,16 +9622,8 @@
             </w:tcMar>
           </w:tcPr>
           <w:p>
-            <w:pPr>
-              <w:spacing w:before="40" w:after="40"/>
-            </w:pPr>
-            <w:r>
-              <w:rPr>
-                <w:rFonts w:ascii="Calibri" w:hAnsi="Calibri"/>
-                <w:color w:val="282828"/>
-                <w:sz w:val="18"/>
-              </w:rPr>
-              <w:t>52</w:t>
+            <w:r>
+              <w:t>T03</w:t>
             </w:r>
           </w:p>
         </w:tc>
@@ -9953,16 +9639,8 @@
             </w:tcMar>
           </w:tcPr>
           <w:p>
-            <w:pPr>
-              <w:spacing w:before="40" w:after="40"/>
-            </w:pPr>
-            <w:r>
-              <w:rPr>
-                <w:rFonts w:ascii="Calibri" w:hAnsi="Calibri"/>
-                <w:color w:val="282828"/>
-                <w:sz w:val="18"/>
-              </w:rPr>
-              <w:t>88</w:t>
+            <w:r>
+              <w:t>Sizzling Chocolate Walnut Brownie</w:t>
             </w:r>
           </w:p>
         </w:tc>
@@ -9978,16 +9656,8 @@
             </w:tcMar>
           </w:tcPr>
           <w:p>
-            <w:pPr>
-              <w:spacing w:before="40" w:after="40"/>
-            </w:pPr>
-            <w:r>
-              <w:rPr>
-                <w:rFonts w:ascii="Calibri" w:hAnsi="Calibri"/>
-                <w:color w:val="282828"/>
-                <w:sz w:val="18"/>
-              </w:rPr>
-              <w:t>₹11,440.00</w:t>
+            <w:r>
+              <w:t>2</w:t>
             </w:r>
           </w:p>
         </w:tc>
@@ -10003,16 +9673,8 @@
             </w:tcMar>
           </w:tcPr>
           <w:p>
-            <w:pPr>
-              <w:spacing w:before="40" w:after="40"/>
-            </w:pPr>
-            <w:r>
-              <w:rPr>
-                <w:rFonts w:ascii="Calibri" w:hAnsi="Calibri"/>
-                <w:color w:val="282828"/>
-                <w:sz w:val="18"/>
-              </w:rPr>
-              <w:t>₹130.00</w:t>
+            <w:r>
+              <w:t>Served</w:t>
             </w:r>
           </w:p>
         </w:tc>
@@ -10049,16 +9711,8 @@
             </w:tcMar>
           </w:tcPr>
           <w:p>
-            <w:pPr>
-              <w:spacing w:before="40" w:after="40"/>
-            </w:pPr>
-            <w:r>
-              <w:rPr>
-                <w:rFonts w:ascii="Calibri" w:hAnsi="Calibri"/>
-                <w:color w:val="282828"/>
-                <w:sz w:val="18"/>
-              </w:rPr>
-              <w:t>Gourmet Desserts</w:t>
+            <w:r>
+              <w:t>Amit &amp; Neha Verma</w:t>
             </w:r>
           </w:p>
         </w:tc>
@@ -10074,16 +9728,8 @@
             </w:tcMar>
           </w:tcPr>
           <w:p>
-            <w:pPr>
-              <w:spacing w:before="40" w:after="40"/>
-            </w:pPr>
-            <w:r>
-              <w:rPr>
-                <w:rFonts w:ascii="Calibri" w:hAnsi="Calibri"/>
-                <w:color w:val="282828"/>
-                <w:sz w:val="18"/>
-              </w:rPr>
-              <w:t>22</w:t>
+            <w:r>
+              <w:t>F01</w:t>
             </w:r>
           </w:p>
         </w:tc>
@@ -10099,16 +9745,8 @@
             </w:tcMar>
           </w:tcPr>
           <w:p>
-            <w:pPr>
-              <w:spacing w:before="40" w:after="40"/>
-            </w:pPr>
-            <w:r>
-              <w:rPr>
-                <w:rFonts w:ascii="Calibri" w:hAnsi="Calibri"/>
-                <w:color w:val="282828"/>
-                <w:sz w:val="18"/>
-              </w:rPr>
-              <w:t>30</w:t>
+            <w:r>
+              <w:t>Paneer Butter Masala Royale</w:t>
             </w:r>
           </w:p>
         </w:tc>
@@ -10124,16 +9762,8 @@
             </w:tcMar>
           </w:tcPr>
           <w:p>
-            <w:pPr>
-              <w:spacing w:before="40" w:after="40"/>
-            </w:pPr>
-            <w:r>
-              <w:rPr>
-                <w:rFonts w:ascii="Calibri" w:hAnsi="Calibri"/>
-                <w:color w:val="282828"/>
-                <w:sz w:val="18"/>
-              </w:rPr>
-              <w:t>₹7,200.00</w:t>
+            <w:r>
+              <w:t>1</w:t>
             </w:r>
           </w:p>
         </w:tc>
@@ -10149,16 +9779,60 @@
             </w:tcMar>
           </w:tcPr>
           <w:p>
-            <w:pPr>
-              <w:spacing w:before="40" w:after="40"/>
-            </w:pPr>
-            <w:r>
-              <w:rPr>
-                <w:rFonts w:ascii="Calibri" w:hAnsi="Calibri"/>
-                <w:color w:val="282828"/>
-                <w:sz w:val="18"/>
-              </w:rPr>
-              <w:t>₹240.00</w:t>
+            <w:r>
+              <w:t>Not Served</w:t>
+            </w:r>
+          </w:p>
+        </w:tc>
+      </w:tr>
+      <w:tr>
+        <w:tc>
+          <w:tcPr>
+            <w:tcW w:type="dxa" w:w="1872"/>
+          </w:tcPr>
+          <w:p>
+            <w:r>
+              <w:t>Arsh Kapoor</w:t>
+            </w:r>
+          </w:p>
+        </w:tc>
+        <w:tc>
+          <w:tcPr>
+            <w:tcW w:type="dxa" w:w="1874"/>
+          </w:tcPr>
+          <w:p>
+            <w:r>
+              <w:t>T01</w:t>
+            </w:r>
+          </w:p>
+        </w:tc>
+        <w:tc>
+          <w:tcPr>
+            <w:tcW w:type="dxa" w:w="1872"/>
+          </w:tcPr>
+          <w:p>
+            <w:r>
+              <w:t>Cold Brew Iced Vanilla Latte</w:t>
+            </w:r>
+          </w:p>
+        </w:tc>
+        <w:tc>
+          <w:tcPr>
+            <w:tcW w:type="dxa" w:w="1872"/>
+          </w:tcPr>
+          <w:p>
+            <w:r>
+              <w:t>1</w:t>
+            </w:r>
+          </w:p>
+        </w:tc>
+        <w:tc>
+          <w:tcPr>
+            <w:tcW w:type="dxa" w:w="1872"/>
+          </w:tcPr>
+          <w:p>
+            <w:r>
+              <w:t>Not Served</w:t>
             </w:r>
           </w:p>
         </w:tc>

</xml_diff>

<commit_message>
Update report serialization from 1. Abstract, fix Section 9 and 10 spacing, and clean docx folder
</commit_message>
<xml_diff>
--- a/docx/DBMS REPORT.docx
+++ b/docx/DBMS REPORT.docx
@@ -395,7 +395,7 @@
           <w:color w:val="102C57"/>
           <w:sz w:val="36"/>
         </w:rPr>
-        <w:t>2. Abstract</w:t>
+        <w:t>1. Abstract</w:t>
       </w:r>
     </w:p>
     <w:p>
@@ -428,7 +428,7 @@
           <w:color w:val="102C57"/>
           <w:sz w:val="36"/>
         </w:rPr>
-        <w:t>3. Introduction and Problem Statement</w:t>
+        <w:t>2. Introduction and Problem Statement</w:t>
       </w:r>
     </w:p>
     <w:p>
@@ -444,7 +444,7 @@
           <w:color w:val="35598F"/>
           <w:sz w:val="28"/>
         </w:rPr>
-        <w:t>3.1 Introduction</w:t>
+        <w:t>2.1 Introduction</w:t>
       </w:r>
     </w:p>
     <w:p>
@@ -465,7 +465,7 @@
           <w:color w:val="35598F"/>
           <w:sz w:val="28"/>
         </w:rPr>
-        <w:t>3.2 Problem Statement</w:t>
+        <w:t>2.2 Problem Statement</w:t>
       </w:r>
     </w:p>
     <w:p>
@@ -516,7 +516,7 @@
           <w:color w:val="102C57"/>
           <w:sz w:val="36"/>
         </w:rPr>
-        <w:t>4. Objectives and Scope</w:t>
+        <w:t>3. Objectives and Scope</w:t>
       </w:r>
     </w:p>
     <w:p>
@@ -532,7 +532,7 @@
           <w:color w:val="35598F"/>
           <w:sz w:val="28"/>
         </w:rPr>
-        <w:t>4.1 Primary Objectives</w:t>
+        <w:t>3.1 Primary Objectives</w:t>
       </w:r>
     </w:p>
     <w:p>
@@ -571,7 +571,7 @@
           <w:color w:val="35598F"/>
           <w:sz w:val="28"/>
         </w:rPr>
-        <w:t>4.2 Scope of the Project</w:t>
+        <w:t>3.2 Scope of the Project</w:t>
       </w:r>
     </w:p>
     <w:p>
@@ -592,7 +592,7 @@
           <w:color w:val="102C57"/>
           <w:sz w:val="36"/>
         </w:rPr>
-        <w:t>5. Software and Hardware Requirements</w:t>
+        <w:t>4. Software and Hardware Requirements</w:t>
       </w:r>
     </w:p>
     <w:tbl>
@@ -1738,7 +1738,7 @@
           <w:color w:val="102C57"/>
           <w:sz w:val="36"/>
         </w:rPr>
-        <w:t>6. Entity-Relationship (ER) Diagram</w:t>
+        <w:t>5. Entity-Relationship (ER) Diagram</w:t>
       </w:r>
     </w:p>
     <w:p>
@@ -1807,7 +1807,7 @@
           <w:color w:val="102C57"/>
           <w:sz w:val="36"/>
         </w:rPr>
-        <w:t>7. Relational Schema and Normalization</w:t>
+        <w:t>6. Relational Schema and Normalization</w:t>
       </w:r>
     </w:p>
     <w:p>
@@ -1823,7 +1823,7 @@
           <w:color w:val="35598F"/>
           <w:sz w:val="28"/>
         </w:rPr>
-        <w:t>7.1 Relational Schema Representation</w:t>
+        <w:t>6.1 Relational Schema Representation</w:t>
       </w:r>
     </w:p>
     <w:p>
@@ -1890,7 +1890,7 @@
           <w:color w:val="35598F"/>
           <w:sz w:val="28"/>
         </w:rPr>
-        <w:t>7.2 Normalization Proofs</w:t>
+        <w:t>6.2 Normalization Proofs</w:t>
       </w:r>
     </w:p>
     <w:p>
@@ -1942,7 +1942,7 @@
           <w:color w:val="102C57"/>
           <w:sz w:val="36"/>
         </w:rPr>
-        <w:t>8. Data Dictionary</w:t>
+        <w:t>7. Data Dictionary</w:t>
       </w:r>
     </w:p>
     <w:p>
@@ -1963,7 +1963,7 @@
           <w:color w:val="35598F"/>
           <w:sz w:val="28"/>
         </w:rPr>
-        <w:t>Table 8.1: table_entity</w:t>
+        <w:t>Table 7.1: table_entity</w:t>
       </w:r>
     </w:p>
     <w:tbl>
@@ -3045,7 +3045,7 @@
           <w:color w:val="35598F"/>
           <w:sz w:val="28"/>
         </w:rPr>
-        <w:t>Table 8.2: reservation</w:t>
+        <w:t>Table 7.2: reservation</w:t>
       </w:r>
     </w:p>
     <w:tbl>
@@ -4419,7 +4419,7 @@
           <w:color w:val="35598F"/>
           <w:sz w:val="28"/>
         </w:rPr>
-        <w:t>Table 8.3: menu_item</w:t>
+        <w:t>Table 7.3: menu_item</w:t>
       </w:r>
     </w:p>
     <w:tbl>
@@ -5647,7 +5647,7 @@
           <w:color w:val="35598F"/>
           <w:sz w:val="28"/>
         </w:rPr>
-        <w:t>Table 8.4: order_item</w:t>
+        <w:t>Table 7.4: order_item</w:t>
       </w:r>
     </w:p>
     <w:tbl>
@@ -6729,7 +6729,7 @@
           <w:color w:val="102C57"/>
           <w:sz w:val="36"/>
         </w:rPr>
-        <w:t>9. SQL Commands Used (DDL, DML) with Sample Outputs</w:t>
+        <w:t>8. SQL Commands Used (DDL, DML) with Sample Outputs</w:t>
       </w:r>
     </w:p>
     <w:p>
@@ -6745,7 +6745,7 @@
           <w:color w:val="35598F"/>
           <w:sz w:val="28"/>
         </w:rPr>
-        <w:t>9.1 Data Definition Language (DDL)</w:t>
+        <w:t>8.1 Data Definition Language (DDL)</w:t>
       </w:r>
     </w:p>
     <w:tbl>
@@ -7310,7 +7310,7 @@
           <w:color w:val="35598F"/>
           <w:sz w:val="28"/>
         </w:rPr>
-        <w:t>9.2 Data Manipulation Language (DML)</w:t>
+        <w:t>8.2 Data Manipulation Language (DML)</w:t>
       </w:r>
     </w:p>
     <w:tbl>
@@ -7624,7 +7624,7 @@
           <w:color w:val="102C57"/>
           <w:sz w:val="36"/>
         </w:rPr>
-        <w:t>10. Queries with Outputs (Including Presentation-II Queries)</w:t>
+        <w:t>9. Queries with Outputs (Including Presentation-II Queries)</w:t>
       </w:r>
     </w:p>
     <w:p>
@@ -7640,7 +7640,7 @@
           <w:color w:val="35598F"/>
           <w:sz w:val="28"/>
         </w:rPr>
-        <w:t>Query 10.1: Concurrency-Safe Table Availability by Ambiance &amp; Slot Window</w:t>
+        <w:t>Query 9.1: Concurrency-Safe Table Availability by Ambiance &amp; Slot Window</w:t>
       </w:r>
     </w:p>
     <w:tbl>
@@ -9030,7 +9030,7 @@
         <w:spacing w:before="280" w:after="120"/>
       </w:pPr>
       <w:r>
-        <w:t>Query 10.2: Presentation-II Query: Customer Orders, Table ID &amp; Serving Status Tracker</w:t>
+        <w:t>Query 9.2: Presentation-II Query: Customer Orders, Table ID &amp; Serving Status Tracker</w:t>
       </w:r>
     </w:p>
     <w:tbl>
@@ -9840,84 +9840,9 @@
     </w:tbl>
     <w:p>
       <w:pPr>
-        <w:spacing w:after="120"/>
-      </w:pPr>
-      <w:r/>
-      <w:r>
-        <w:drawing>
-          <wp:inline xmlns:a="http://schemas.openxmlformats.org/drawingml/2006/main" xmlns:pic="http://schemas.openxmlformats.org/drawingml/2006/picture">
-            <wp:extent cx="5943600" cy="975122"/>
-            <wp:docPr id="13" name="Picture 13"/>
-            <wp:cNvGraphicFramePr>
-              <a:graphicFrameLocks noChangeAspect="1"/>
-            </wp:cNvGraphicFramePr>
-            <a:graphic>
-              <a:graphicData uri="http://schemas.openxmlformats.org/drawingml/2006/picture">
-                <pic:pic>
-                  <pic:nvPicPr>
-                    <pic:cNvPr id="0" name="image.jpg"/>
-                    <pic:cNvPicPr/>
-                  </pic:nvPicPr>
-                  <pic:blipFill>
-                    <a:blip r:embed="rId17"/>
-                    <a:stretch>
-                      <a:fillRect/>
-                    </a:stretch>
-                  </pic:blipFill>
-                  <pic:spPr>
-                    <a:xfrm>
-                      <a:off x="0" y="0"/>
-                      <a:ext cx="5943600" cy="975122"/>
-                    </a:xfrm>
-                    <a:prstGeom prst="rect"/>
-                  </pic:spPr>
-                </pic:pic>
-              </a:graphicData>
-            </a:graphic>
-          </wp:inline>
-        </w:drawing>
-        <w:br/>
-      </w:r>
-      <w:r>
-        <w:drawing>
-          <wp:inline xmlns:a="http://schemas.openxmlformats.org/drawingml/2006/main" xmlns:pic="http://schemas.openxmlformats.org/drawingml/2006/picture">
-            <wp:extent cx="5943600" cy="2115403"/>
-            <wp:docPr id="14" name="Picture 14"/>
-            <wp:cNvGraphicFramePr>
-              <a:graphicFrameLocks noChangeAspect="1"/>
-            </wp:cNvGraphicFramePr>
-            <a:graphic>
-              <a:graphicData uri="http://schemas.openxmlformats.org/drawingml/2006/picture">
-                <pic:pic>
-                  <pic:nvPicPr>
-                    <pic:cNvPr id="0" name="image.jpg"/>
-                    <pic:cNvPicPr/>
-                  </pic:nvPicPr>
-                  <pic:blipFill>
-                    <a:blip r:embed="rId18"/>
-                    <a:stretch>
-                      <a:fillRect/>
-                    </a:stretch>
-                  </pic:blipFill>
-                  <pic:spPr>
-                    <a:xfrm>
-                      <a:off x="0" y="0"/>
-                      <a:ext cx="5943600" cy="2115403"/>
-                    </a:xfrm>
-                    <a:prstGeom prst="rect"/>
-                  </pic:spPr>
-                </pic:pic>
-              </a:graphicData>
-            </a:graphic>
-          </wp:inline>
-        </w:drawing>
-      </w:r>
-    </w:p>
-    <w:p>
-      <w:pPr>
         <w:pStyle w:val="2"/>
         <w:keepNext/>
-        <w:spacing w:before="280" w:after="120"/>
+        <w:spacing w:before="200" w:after="120"/>
       </w:pPr>
       <w:r>
         <w:rPr>
@@ -9926,7 +9851,7 @@
           <w:color w:val="102C57"/>
           <w:sz w:val="36"/>
         </w:rPr>
-        <w:t>11. User Interface Design &amp; Architecture</w:t>
+        <w:t>10. User Interface Design &amp; Architecture</w:t>
       </w:r>
     </w:p>
     <w:p>
@@ -10188,7 +10113,7 @@
           <w:color w:val="102C57"/>
           <w:sz w:val="36"/>
         </w:rPr>
-        <w:t>12. Implementation Details</w:t>
+        <w:t>11. Implementation Details</w:t>
       </w:r>
     </w:p>
     <w:p>
@@ -10204,7 +10129,7 @@
           <w:color w:val="35598F"/>
           <w:sz w:val="28"/>
         </w:rPr>
-        <w:t>12.1 Technology Stack &amp; Architectural Pattern</w:t>
+        <w:t>11.1 Technology Stack &amp; Architectural Pattern</w:t>
       </w:r>
     </w:p>
     <w:p>
@@ -10243,7 +10168,7 @@
           <w:color w:val="35598F"/>
           <w:sz w:val="28"/>
         </w:rPr>
-        <w:t>12.2 Key Backend Code Snippets</w:t>
+        <w:t>11.2 Key Backend Code Snippets</w:t>
       </w:r>
     </w:p>
     <w:tbl>
@@ -10693,7 +10618,7 @@
           <w:color w:val="102C57"/>
           <w:sz w:val="36"/>
         </w:rPr>
-        <w:t>13. Testing (Test Cases and Results)</w:t>
+        <w:t>12. Testing (Test Cases and Results)</w:t>
       </w:r>
     </w:p>
     <w:p>
@@ -12642,7 +12567,7 @@
           <w:color w:val="102C57"/>
           <w:sz w:val="36"/>
         </w:rPr>
-        <w:t>14. Conclusion and Future Enhancements</w:t>
+        <w:t>13. Conclusion and Future Enhancements</w:t>
       </w:r>
     </w:p>
     <w:p>
@@ -12658,7 +12583,7 @@
           <w:color w:val="35598F"/>
           <w:sz w:val="28"/>
         </w:rPr>
-        <w:t>14.1 Conclusion</w:t>
+        <w:t>13.1 Conclusion</w:t>
       </w:r>
     </w:p>
     <w:p>
@@ -12679,7 +12604,7 @@
           <w:color w:val="35598F"/>
           <w:sz w:val="28"/>
         </w:rPr>
-        <w:t>14.2 Future Enhancements</w:t>
+        <w:t>13.2 Future Enhancements</w:t>
       </w:r>
     </w:p>
     <w:p>
@@ -12718,7 +12643,7 @@
           <w:color w:val="102C57"/>
           <w:sz w:val="36"/>
         </w:rPr>
-        <w:t>15. References</w:t>
+        <w:t>14. References</w:t>
       </w:r>
     </w:p>
     <w:p>
@@ -12769,7 +12694,7 @@
           <w:color w:val="102C57"/>
           <w:sz w:val="36"/>
         </w:rPr>
-        <w:t>16. Appendix: GitHub Repository Link &amp; Setup Guide</w:t>
+        <w:t>15. Appendix: GitHub Repository Link &amp; Setup Guide</w:t>
       </w:r>
     </w:p>
     <w:p>

</xml_diff>

<commit_message>
Enhance cover page: enlarge Woxsen logo and balance title spacing
</commit_message>
<xml_diff>
--- a/docx/DBMS REPORT.docx
+++ b/docx/DBMS REPORT.docx
@@ -10,7 +10,7 @@
       <w:r>
         <w:drawing>
           <wp:inline xmlns:a="http://schemas.openxmlformats.org/drawingml/2006/main" xmlns:pic="http://schemas.openxmlformats.org/drawingml/2006/picture">
-            <wp:extent cx="2286000" cy="1482213"/>
+            <wp:extent cx="2606040" cy="1689722"/>
             <wp:docPr id="11" name="Picture 11"/>
             <wp:cNvGraphicFramePr>
               <a:graphicFrameLocks noChangeAspect="1"/>
@@ -31,7 +31,7 @@
                   <pic:spPr>
                     <a:xfrm>
                       <a:off x="0" y="0"/>
-                      <a:ext cx="2286000" cy="1482213"/>
+                      <a:ext cx="2606040" cy="1689722"/>
                     </a:xfrm>
                     <a:prstGeom prst="rect"/>
                   </pic:spPr>
@@ -44,7 +44,7 @@
     </w:p>
     <w:p>
       <w:pPr>
-        <w:spacing w:before="1200"/>
+        <w:spacing w:before="400" w:after="240"/>
         <w:jc w:val="center"/>
       </w:pPr>
       <w:r>
@@ -136,7 +136,6 @@
           <w:color w:val="102C57"/>
           <w:sz w:val="44"/>
         </w:rPr>
-        <w:br w:type="textWrapping"/>
       </w:r>
       <w:r>
         <w:rPr>
@@ -145,7 +144,6 @@
           <w:color w:val="102C57"/>
           <w:sz w:val="44"/>
         </w:rPr>
-        <w:br w:type="textWrapping"/>
       </w:r>
       <w:r>
         <w:rPr>
@@ -154,12 +152,11 @@
           <w:color w:val="102C57"/>
           <w:sz w:val="44"/>
         </w:rPr>
-        <w:br w:type="textWrapping"/>
       </w:r>
     </w:p>
     <w:p>
       <w:pPr>
-        <w:spacing w:before="800" w:line="336" w:lineRule="auto"/>
+        <w:spacing w:before="480" w:line="336" w:lineRule="auto"/>
         <w:jc w:val="center"/>
       </w:pPr>
       <w:r>
@@ -168,7 +165,6 @@
           <w:color w:val="282828"/>
           <w:sz w:val="22"/>
         </w:rPr>
-        <w:br w:type="textWrapping"/>
       </w:r>
       <w:r>
         <w:rPr>
@@ -176,7 +172,6 @@
           <w:color w:val="282828"/>
           <w:sz w:val="22"/>
         </w:rPr>
-        <w:t xml:space="preserve">    </w:t>
       </w:r>
       <w:r>
         <w:rPr>
@@ -184,7 +179,6 @@
           <w:color w:val="282828"/>
           <w:sz w:val="22"/>
         </w:rPr>
-        <w:br w:type="textWrapping"/>
       </w:r>
       <w:r>
         <w:rPr>
@@ -192,7 +186,6 @@
           <w:color w:val="282828"/>
           <w:sz w:val="22"/>
         </w:rPr>
-        <w:t xml:space="preserve">    </w:t>
       </w:r>
       <w:r>
         <w:rPr>

</xml_diff>

<commit_message>
Restore Woxsen logo file, add spacing after section 9, and update GitHub repo link in setup instructions
</commit_message>
<xml_diff>
--- a/docx/DBMS REPORT.docx
+++ b/docx/DBMS REPORT.docx
@@ -9835,7 +9835,7 @@
       <w:pPr>
         <w:pStyle w:val="2"/>
         <w:keepNext/>
-        <w:spacing w:before="200" w:after="120"/>
+        <w:spacing w:before="560" w:after="120"/>
       </w:pPr>
       <w:r>
         <w:rPr>
@@ -12725,7 +12725,7 @@
         <w:br w:type="textWrapping"/>
       </w:r>
       <w:r>
-        <w:t xml:space="preserve">   git clone https://github.com/[Your-Username]/DineDesk-Restaurant-Platform.git</w:t>
+        <w:t xml:space="preserve">   git clone https://github.com/sahajasakhunala/DineDesk.git</w:t>
       </w:r>
       <w:r>
         <w:br w:type="textWrapping"/>

</xml_diff>

<commit_message>
Upgrade Woxsen logo to ultra-high-resolution (2400px): sharp, crystal-clear pixels on PDF title page
</commit_message>
<xml_diff>
--- a/docx/DBMS REPORT.docx
+++ b/docx/DBMS REPORT.docx
@@ -10,7 +10,7 @@
       <w:r>
         <w:drawing>
           <wp:inline xmlns:a="http://schemas.openxmlformats.org/drawingml/2006/main" xmlns:pic="http://schemas.openxmlformats.org/drawingml/2006/picture">
-            <wp:extent cx="2286000" cy="1110574"/>
+            <wp:extent cx="2286000" cy="1064895"/>
             <wp:docPr id="1" name="Picture 1"/>
             <wp:cNvGraphicFramePr>
               <a:graphicFrameLocks noChangeAspect="1"/>
@@ -31,7 +31,7 @@
                   <pic:spPr>
                     <a:xfrm>
                       <a:off x="0" y="0"/>
-                      <a:ext cx="2286000" cy="1110574"/>
+                      <a:ext cx="2286000" cy="1064895"/>
                     </a:xfrm>
                     <a:prstGeom prst="rect"/>
                   </pic:spPr>

</xml_diff>